<commit_message>
M2 docs: latest Sections 1 and 5 (Oct 19 requirement IDs), Section 4 and evidence wording fixes
</commit_message>
<xml_diff>
--- a/milestones/M2/SpatialOS_M2_Section1_Data_Definitions.docx
+++ b/milestones/M2/SpatialOS_M2_Section1_Data_Definitions.docx
@@ -272,35 +272,7 @@
                 <w:sz w:val="19"/>
                 <w:szCs w:val="19"/>
               </w:rPr>
-              <w:t xml:space="preserve">A </w:t>
-            </w:r>
-            <w:r>
-              <w:rPr>
-                <w:sz w:val="19"/>
-                <w:szCs w:val="19"/>
-              </w:rPr>
-              <w:t xml:space="preserve">path segment</w:t>
-            </w:r>
-            <w:r>
-              <w:rPr>
-                <w:sz w:val="19"/>
-                <w:szCs w:val="19"/>
-              </w:rPr>
-              <w:t xml:space="preserve"> is a walkable connection between two </w:t>
-            </w:r>
-            <w:r>
-              <w:rPr>
-                <w:sz w:val="19"/>
-                <w:szCs w:val="19"/>
-              </w:rPr>
-              <w:t xml:space="preserve">graph nodes</w:t>
-            </w:r>
-            <w:r>
-              <w:rPr>
-                <w:sz w:val="19"/>
-                <w:szCs w:val="19"/>
-              </w:rPr>
-              <w:t xml:space="preserve">. The requirements list (Section 2) calls a path segment an </w:t>
+              <w:t xml:space="preserve">A path segment is a walkable connection between two graph nodes. Section 2 uses the same term; the M1 requirements called it an </w:t>
             </w:r>
             <w:r>
               <w:rPr>
@@ -21350,21 +21322,7 @@
                 <w:sz w:val="19"/>
                 <w:szCs w:val="19"/>
               </w:rPr>
-              <w:t xml:space="preserve">≥10 attempts </w:t>
-            </w:r>
-            <w:r>
-              <w:rPr>
-                <w:sz w:val="19"/>
-                <w:szCs w:val="19"/>
-              </w:rPr>
-              <w:t xml:space="preserve">and</w:t>
-            </w:r>
-            <w:r>
-              <w:rPr>
-                <w:sz w:val="19"/>
-                <w:szCs w:val="19"/>
-              </w:rPr>
-              <w:t xml:space="preserve"> success below 60%</w:t>
+              <w:t xml:space="preserve">≥10 attempts and success below 60%</w:t>
             </w:r>
           </w:p>
         </w:tc>
@@ -21444,35 +21402,7 @@
                 <w:sz w:val="19"/>
                 <w:szCs w:val="19"/>
               </w:rPr>
-              <w:t xml:space="preserve">≥10 attempts </w:t>
-            </w:r>
-            <w:r>
-              <w:rPr>
-                <w:sz w:val="19"/>
-                <w:szCs w:val="19"/>
-              </w:rPr>
-              <w:t xml:space="preserve">and</w:t>
-            </w:r>
-            <w:r>
-              <w:rPr>
-                <w:sz w:val="19"/>
-                <w:szCs w:val="19"/>
-              </w:rPr>
-              <w:t xml:space="preserve"> ≥5 valid error samples </w:t>
-            </w:r>
-            <w:r>
-              <w:rPr>
-                <w:sz w:val="19"/>
-                <w:szCs w:val="19"/>
-              </w:rPr>
-              <w:t xml:space="preserve">and</w:t>
-            </w:r>
-            <w:r>
-              <w:rPr>
-                <w:sz w:val="19"/>
-                <w:szCs w:val="19"/>
-              </w:rPr>
-              <w:t xml:space="preserve"> median error above 1.5 m</w:t>
+              <w:t xml:space="preserve">≥10 attempts and ≥5 valid error samples and median error above 1.5 m</w:t>
             </w:r>
           </w:p>
         </w:tc>
@@ -21632,21 +21562,7 @@
                 <w:sz w:val="19"/>
                 <w:szCs w:val="19"/>
               </w:rPr>
-              <w:t xml:space="preserve">≥10 attempts, ≥5 valid error samples, success ≥80% </w:t>
-            </w:r>
-            <w:r>
-              <w:rPr>
-                <w:sz w:val="19"/>
-                <w:szCs w:val="19"/>
-              </w:rPr>
-              <w:t xml:space="preserve">and</w:t>
-            </w:r>
-            <w:r>
-              <w:rPr>
-                <w:sz w:val="19"/>
-                <w:szCs w:val="19"/>
-              </w:rPr>
-              <w:t xml:space="preserve"> median error ≤1 m</w:t>
+              <w:t xml:space="preserve">≥10 attempts, ≥5 valid error samples, success ≥80% and median error ≤1 m</w:t>
             </w:r>
           </w:p>
         </w:tc>
@@ -23940,7 +23856,7 @@
                 <w:sz w:val="19"/>
                 <w:szCs w:val="19"/>
               </w:rPr>
-              <w:t xml:space="preserve">R2.3, R5.2, R5.4, R7.1, R7.2, R8.1–R8.3, R17.1, R17.2</w:t>
+              <w:t xml:space="preserve">R2.3, R5.2, R5.4, R7.1, R7.2, R8.1–R8.3, R15.3, R17.1, R17.2</w:t>
             </w:r>
           </w:p>
         </w:tc>
@@ -24020,7 +23936,7 @@
                 <w:sz w:val="19"/>
                 <w:szCs w:val="19"/>
               </w:rPr>
-              <w:t xml:space="preserve">R2.4, R5.1, R7.3</w:t>
+              <w:t xml:space="preserve">R2.4, R5.1, R7.3, R15.3</w:t>
             </w:r>
           </w:p>
         </w:tc>
@@ -24260,7 +24176,7 @@
                 <w:sz w:val="19"/>
                 <w:szCs w:val="19"/>
               </w:rPr>
-              <w:t xml:space="preserve">R3.2, R3.3, R4.1, R4.2, R6.2–R6.4, R11.1, R11.2</w:t>
+              <w:t xml:space="preserve">R3.2, R3.3, R3.5, R4.1, R4.2, R6.2–R6.5, R11.1, R11.2</w:t>
             </w:r>
           </w:p>
         </w:tc>

</xml_diff>